<commit_message>
add file and achive MH_zh_en
</commit_message>
<xml_diff>
--- a/collection/1. 项目分析设计文档/1.7《中英文翻译系统》项目安装部署手册.docx
+++ b/collection/1. 项目分析设计文档/1.7《中英文翻译系统》项目安装部署手册.docx
@@ -57,12 +57,6 @@
         <w:gridCol w:w="8280"/>
       </w:tblGrid>
       <w:tr>
-        <w:tblPrEx>
-          <w:tblCellMar>
-            <w:top w:w="0" w:type="dxa"/>
-            <w:bottom w:w="0" w:type="dxa"/>
-          </w:tblCellMar>
-        </w:tblPrEx>
         <w:tc>
           <w:tcPr>
             <w:tcW w:w="8280" w:type="dxa"/>
@@ -825,12 +819,6 @@
         <w:gridCol w:w="8280"/>
       </w:tblGrid>
       <w:tr>
-        <w:tblPrEx>
-          <w:tblCellMar>
-            <w:top w:w="0" w:type="dxa"/>
-            <w:bottom w:w="0" w:type="dxa"/>
-          </w:tblCellMar>
-        </w:tblPrEx>
         <w:tc>
           <w:tcPr>
             <w:tcW w:w="8280" w:type="dxa"/>
@@ -1078,12 +1066,6 @@
         <w:gridCol w:w="8280"/>
       </w:tblGrid>
       <w:tr>
-        <w:tblPrEx>
-          <w:tblCellMar>
-            <w:top w:w="0" w:type="dxa"/>
-            <w:bottom w:w="0" w:type="dxa"/>
-          </w:tblCellMar>
-        </w:tblPrEx>
         <w:tc>
           <w:tcPr>
             <w:tcW w:w="8280" w:type="dxa"/>
@@ -1120,19 +1102,7 @@
               <w:rPr>
                 <w:rFonts w:ascii="Consolas" w:eastAsia="Consolas" w:hAnsi="Consolas" w:cs="Consolas"/>
               </w:rPr>
-              <w:t xml:space="preserve"># </w:t>
-            </w:r>
-            <w:r>
-              <w:rPr>
-                <w:rFonts w:ascii="Consolas" w:eastAsia="Consolas" w:hAnsi="Consolas" w:cs="Consolas"/>
-              </w:rPr>
-              <w:t>创建名为</w:t>
-            </w:r>
-            <w:r>
-              <w:rPr>
-                <w:rFonts w:ascii="Consolas" w:eastAsia="Consolas" w:hAnsi="Consolas" w:cs="Consolas"/>
-              </w:rPr>
-              <w:t xml:space="preserve"> </w:t>
+              <w:t xml:space="preserve"># 创建名为 </w:t>
             </w:r>
             <w:proofErr w:type="spellStart"/>
             <w:r>
@@ -1146,19 +1116,7 @@
               <w:rPr>
                 <w:rFonts w:ascii="Consolas" w:eastAsia="Consolas" w:hAnsi="Consolas" w:cs="Consolas"/>
               </w:rPr>
-              <w:t xml:space="preserve"> </w:t>
-            </w:r>
-            <w:r>
-              <w:rPr>
-                <w:rFonts w:ascii="Consolas" w:eastAsia="Consolas" w:hAnsi="Consolas" w:cs="Consolas"/>
-              </w:rPr>
-              <w:t>的</w:t>
-            </w:r>
-            <w:r>
-              <w:rPr>
-                <w:rFonts w:ascii="Consolas" w:eastAsia="Consolas" w:hAnsi="Consolas" w:cs="Consolas"/>
-              </w:rPr>
-              <w:t xml:space="preserve"> </w:t>
+              <w:t xml:space="preserve"> 的 </w:t>
             </w:r>
             <w:proofErr w:type="spellStart"/>
             <w:r>
@@ -1172,13 +1130,7 @@
               <w:rPr>
                 <w:rFonts w:ascii="Consolas" w:eastAsia="Consolas" w:hAnsi="Consolas" w:cs="Consolas"/>
               </w:rPr>
-              <w:t xml:space="preserve"> </w:t>
-            </w:r>
-            <w:r>
-              <w:rPr>
-                <w:rFonts w:ascii="Consolas" w:eastAsia="Consolas" w:hAnsi="Consolas" w:cs="Consolas"/>
-              </w:rPr>
-              <w:t>环境</w:t>
+              <w:t xml:space="preserve"> 环境</w:t>
             </w:r>
             <w:r>
               <w:rPr>
@@ -1225,13 +1177,7 @@
                 <w:rFonts w:ascii="Consolas" w:eastAsia="Consolas" w:hAnsi="Consolas" w:cs="Consolas"/>
               </w:rPr>
               <w:br/>
-              <w:t xml:space="preserve"># </w:t>
-            </w:r>
-            <w:r>
-              <w:rPr>
-                <w:rFonts w:ascii="Consolas" w:eastAsia="Consolas" w:hAnsi="Consolas" w:cs="Consolas"/>
-              </w:rPr>
-              <w:t>激活环境</w:t>
+              <w:t># 激活环境</w:t>
             </w:r>
             <w:r>
               <w:rPr>
@@ -1442,12 +1388,6 @@
         <w:gridCol w:w="8280"/>
       </w:tblGrid>
       <w:tr>
-        <w:tblPrEx>
-          <w:tblCellMar>
-            <w:top w:w="0" w:type="dxa"/>
-            <w:bottom w:w="0" w:type="dxa"/>
-          </w:tblCellMar>
-        </w:tblPrEx>
         <w:tc>
           <w:tcPr>
             <w:tcW w:w="8280" w:type="dxa"/>
@@ -1484,25 +1424,7 @@
               <w:rPr>
                 <w:rFonts w:ascii="Consolas" w:eastAsia="Consolas" w:hAnsi="Consolas" w:cs="Consolas"/>
               </w:rPr>
-              <w:t xml:space="preserve"># </w:t>
-            </w:r>
-            <w:r>
-              <w:rPr>
-                <w:rFonts w:ascii="Consolas" w:eastAsia="Consolas" w:hAnsi="Consolas" w:cs="Consolas"/>
-              </w:rPr>
-              <w:t>检查</w:t>
-            </w:r>
-            <w:r>
-              <w:rPr>
-                <w:rFonts w:ascii="Consolas" w:eastAsia="Consolas" w:hAnsi="Consolas" w:cs="Consolas"/>
-              </w:rPr>
-              <w:t xml:space="preserve"> GPU </w:t>
-            </w:r>
-            <w:r>
-              <w:rPr>
-                <w:rFonts w:ascii="Consolas" w:eastAsia="Consolas" w:hAnsi="Consolas" w:cs="Consolas"/>
-              </w:rPr>
-              <w:t>驱动</w:t>
+              <w:t># 检查 GPU 驱动</w:t>
             </w:r>
             <w:r>
               <w:rPr>
@@ -1689,12 +1611,6 @@
         <w:gridCol w:w="8280"/>
       </w:tblGrid>
       <w:tr>
-        <w:tblPrEx>
-          <w:tblCellMar>
-            <w:top w:w="0" w:type="dxa"/>
-            <w:bottom w:w="0" w:type="dxa"/>
-          </w:tblCellMar>
-        </w:tblPrEx>
         <w:tc>
           <w:tcPr>
             <w:tcW w:w="8280" w:type="dxa"/>
@@ -1731,19 +1647,7 @@
               <w:rPr>
                 <w:rFonts w:ascii="Consolas" w:eastAsia="Consolas" w:hAnsi="Consolas" w:cs="Consolas"/>
               </w:rPr>
-              <w:t xml:space="preserve"># </w:t>
-            </w:r>
-            <w:r>
-              <w:rPr>
-                <w:rFonts w:ascii="Consolas" w:eastAsia="Consolas" w:hAnsi="Consolas" w:cs="Consolas"/>
-              </w:rPr>
-              <w:t>假设</w:t>
-            </w:r>
-            <w:r>
-              <w:rPr>
-                <w:rFonts w:ascii="Consolas" w:eastAsia="Consolas" w:hAnsi="Consolas" w:cs="Consolas"/>
-              </w:rPr>
-              <w:t xml:space="preserve"> CUDA 11.8</w:t>
+              <w:t># 假设 CUDA 11.8</w:t>
             </w:r>
             <w:r>
               <w:rPr>
@@ -1875,25 +1779,7 @@
               <w:rPr>
                 <w:rFonts w:ascii="Consolas" w:eastAsia="Consolas" w:hAnsi="Consolas" w:cs="Consolas"/>
               </w:rPr>
-              <w:t xml:space="preserve">())  # True </w:t>
-            </w:r>
-            <w:r>
-              <w:rPr>
-                <w:rFonts w:ascii="Consolas" w:eastAsia="Consolas" w:hAnsi="Consolas" w:cs="Consolas"/>
-              </w:rPr>
-              <w:t>表示</w:t>
-            </w:r>
-            <w:r>
-              <w:rPr>
-                <w:rFonts w:ascii="Consolas" w:eastAsia="Consolas" w:hAnsi="Consolas" w:cs="Consolas"/>
-              </w:rPr>
-              <w:t xml:space="preserve"> GPU </w:t>
-            </w:r>
-            <w:r>
-              <w:rPr>
-                <w:rFonts w:ascii="Consolas" w:eastAsia="Consolas" w:hAnsi="Consolas" w:cs="Consolas"/>
-              </w:rPr>
-              <w:t>可用</w:t>
+              <w:t>())  # True 表示 GPU 可用</w:t>
             </w:r>
             <w:r>
               <w:rPr>
@@ -2027,12 +1913,6 @@
         <w:gridCol w:w="8280"/>
       </w:tblGrid>
       <w:tr>
-        <w:tblPrEx>
-          <w:tblCellMar>
-            <w:top w:w="0" w:type="dxa"/>
-            <w:bottom w:w="0" w:type="dxa"/>
-          </w:tblCellMar>
-        </w:tblPrEx>
         <w:tc>
           <w:tcPr>
             <w:tcW w:w="8280" w:type="dxa"/>
@@ -2190,12 +2070,6 @@
         <w:gridCol w:w="8280"/>
       </w:tblGrid>
       <w:tr>
-        <w:tblPrEx>
-          <w:tblCellMar>
-            <w:top w:w="0" w:type="dxa"/>
-            <w:bottom w:w="0" w:type="dxa"/>
-          </w:tblCellMar>
-        </w:tblPrEx>
         <w:tc>
           <w:tcPr>
             <w:tcW w:w="8280" w:type="dxa"/>
@@ -2233,13 +2107,7 @@
               <w:rPr>
                 <w:rFonts w:ascii="Consolas" w:eastAsia="Consolas" w:hAnsi="Consolas" w:cs="Consolas"/>
               </w:rPr>
-              <w:t xml:space="preserve"># </w:t>
-            </w:r>
-            <w:r>
-              <w:rPr>
-                <w:rFonts w:ascii="Consolas" w:eastAsia="Consolas" w:hAnsi="Consolas" w:cs="Consolas"/>
-              </w:rPr>
-              <w:t>更新软件源</w:t>
+              <w:t># 更新软件源</w:t>
             </w:r>
             <w:r>
               <w:rPr>
@@ -2320,25 +2188,7 @@
                 <w:rFonts w:ascii="Consolas" w:eastAsia="Consolas" w:hAnsi="Consolas" w:cs="Consolas"/>
               </w:rPr>
               <w:br/>
-              <w:t xml:space="preserve"># </w:t>
-            </w:r>
-            <w:r>
-              <w:rPr>
-                <w:rFonts w:ascii="Consolas" w:eastAsia="Consolas" w:hAnsi="Consolas" w:cs="Consolas"/>
-              </w:rPr>
-              <w:t>下载</w:t>
-            </w:r>
-            <w:r>
-              <w:rPr>
-                <w:rFonts w:ascii="Consolas" w:eastAsia="Consolas" w:hAnsi="Consolas" w:cs="Consolas"/>
-              </w:rPr>
-              <w:t xml:space="preserve"> MySQL APT </w:t>
-            </w:r>
-            <w:r>
-              <w:rPr>
-                <w:rFonts w:ascii="Consolas" w:eastAsia="Consolas" w:hAnsi="Consolas" w:cs="Consolas"/>
-              </w:rPr>
-              <w:t>配置包</w:t>
+              <w:t># 下载 MySQL APT 配置包</w:t>
             </w:r>
             <w:r>
               <w:rPr>
@@ -2439,19 +2289,7 @@
                 <w:rFonts w:ascii="Consolas" w:eastAsia="Consolas" w:hAnsi="Consolas" w:cs="Consolas"/>
               </w:rPr>
               <w:br/>
-              <w:t xml:space="preserve"># </w:t>
-            </w:r>
-            <w:r>
-              <w:rPr>
-                <w:rFonts w:ascii="Consolas" w:eastAsia="Consolas" w:hAnsi="Consolas" w:cs="Consolas"/>
-              </w:rPr>
-              <w:t>安装</w:t>
-            </w:r>
-            <w:r>
-              <w:rPr>
-                <w:rFonts w:ascii="Consolas" w:eastAsia="Consolas" w:hAnsi="Consolas" w:cs="Consolas"/>
-              </w:rPr>
-              <w:t xml:space="preserve"> MySQL Server</w:t>
+              <w:t># 安装 MySQL Server</w:t>
             </w:r>
             <w:r>
               <w:rPr>
@@ -2498,25 +2336,7 @@
                 <w:rFonts w:ascii="Consolas" w:eastAsia="Consolas" w:hAnsi="Consolas" w:cs="Consolas"/>
               </w:rPr>
               <w:br/>
-              <w:t xml:space="preserve"># </w:t>
-            </w:r>
-            <w:r>
-              <w:rPr>
-                <w:rFonts w:ascii="Consolas" w:eastAsia="Consolas" w:hAnsi="Consolas" w:cs="Consolas"/>
-              </w:rPr>
-              <w:t>启动</w:t>
-            </w:r>
-            <w:r>
-              <w:rPr>
-                <w:rFonts w:ascii="Consolas" w:eastAsia="Consolas" w:hAnsi="Consolas" w:cs="Consolas"/>
-              </w:rPr>
-              <w:t xml:space="preserve"> MySQL </w:t>
-            </w:r>
-            <w:r>
-              <w:rPr>
-                <w:rFonts w:ascii="Consolas" w:eastAsia="Consolas" w:hAnsi="Consolas" w:cs="Consolas"/>
-              </w:rPr>
-              <w:t>服务</w:t>
+              <w:t># 启动 MySQL 服务</w:t>
             </w:r>
             <w:r>
               <w:rPr>
@@ -2613,13 +2433,7 @@
                 <w:rFonts w:ascii="Consolas" w:eastAsia="Consolas" w:hAnsi="Consolas" w:cs="Consolas"/>
               </w:rPr>
               <w:br/>
-              <w:t xml:space="preserve"># </w:t>
-            </w:r>
-            <w:r>
-              <w:rPr>
-                <w:rFonts w:ascii="Consolas" w:eastAsia="Consolas" w:hAnsi="Consolas" w:cs="Consolas"/>
-              </w:rPr>
-              <w:t>安全配置</w:t>
+              <w:t># 安全配置</w:t>
             </w:r>
             <w:r>
               <w:rPr>
@@ -2707,12 +2521,6 @@
         <w:gridCol w:w="8280"/>
       </w:tblGrid>
       <w:tr>
-        <w:tblPrEx>
-          <w:tblCellMar>
-            <w:top w:w="0" w:type="dxa"/>
-            <w:bottom w:w="0" w:type="dxa"/>
-          </w:tblCellMar>
-        </w:tblPrEx>
         <w:tc>
           <w:tcPr>
             <w:tcW w:w="8280" w:type="dxa"/>
@@ -2770,13 +2578,7 @@
                 <w:rFonts w:ascii="Consolas" w:eastAsia="Consolas" w:hAnsi="Consolas" w:cs="Consolas"/>
               </w:rPr>
               <w:br/>
-              <w:t xml:space="preserve"># </w:t>
-            </w:r>
-            <w:r>
-              <w:rPr>
-                <w:rFonts w:ascii="Consolas" w:eastAsia="Consolas" w:hAnsi="Consolas" w:cs="Consolas"/>
-              </w:rPr>
-              <w:t>或者</w:t>
+              <w:t># 或者</w:t>
             </w:r>
             <w:r>
               <w:rPr>
@@ -2905,9 +2707,6 @@
         <w:instrText>HYPERLINK "https://modelscope.cn/models/deepseek-ai/DeepSeek-R1-Distill-Qwen-1.5B" \h</w:instrText>
       </w:r>
       <w:r>
-        <w:rPr>
-          <w:rFonts w:hint="eastAsia"/>
-        </w:rPr>
         <w:fldChar w:fldCharType="separate"/>
       </w:r>
       <w:r>
@@ -2961,9 +2760,6 @@
         <w:instrText>HYPERLINK "https://modelscope.cn/models/Qwen/Qwen3-0.6B" \h</w:instrText>
       </w:r>
       <w:r>
-        <w:rPr>
-          <w:rFonts w:hint="eastAsia"/>
-        </w:rPr>
         <w:fldChar w:fldCharType="separate"/>
       </w:r>
       <w:r>
@@ -3166,9 +2962,6 @@
         <w:instrText>HYPERLINK "https://modelscope.cn/datasets/iic/WMT-Chinese-to-English-Machine-Translation-Training-Corpus" \h</w:instrText>
       </w:r>
       <w:r>
-        <w:rPr>
-          <w:rFonts w:hint="eastAsia"/>
-        </w:rPr>
         <w:fldChar w:fldCharType="separate"/>
       </w:r>
       <w:r>

</xml_diff>